<commit_message>
Sync CV content with latest edits and update English version
Apply the user's latest Spanish CV edits to both languages: founder
venture portfolio now 7 products (dropped URBO), venture start date
moved to 2023, NexusPatio Tech role updated to Consulting Coordinator
with an end date, Software Architect role company corrected back to
InAdvance, teaching section updated with the new AI Diploma and GUIDE
article, expanded technical skills (Nest.js, React.js, Azure DevOps,
ClickUp, Assembla, microservices, WebSockets), and removed the
standalone SaaS course entry from Education. Also moves name/title/
contact out of the Word running header back into the document body
for ATS compatibility, and fixes a few grammar/typo slips.
</commit_message>
<xml_diff>
--- a/cv/CV_Jimmy_Requena_EN.docx
+++ b/cv/CV_Jimmy_Requena_EN.docx
@@ -31,7 +31,7 @@
           <w:sz w:val="22"/>
           <w:szCs w:val="22"/>
         </w:rPr>
-        <w:t xml:space="preserve">PMO | Systems Engineer | Founder &amp; AI Automation Builder | M.Sc. Computer Science | CSPO®</w:t>
+        <w:t xml:space="preserve">PMO | Systems Engineer | Founder &amp; AI Automation Builder | CSPO® | SMPC®</w:t>
       </w:r>
     </w:p>
     <w:p>
@@ -45,7 +45,7 @@
           <w:sz w:val="20"/>
           <w:szCs w:val="20"/>
         </w:rPr>
-        <w:t xml:space="preserve">Santa Cruz de la Sierra, Bolivia | +591 75009349 | +1 914 222 3263 | jimrequena@bolivianotech.com | jimrequena@hotmail.com</w:t>
+        <w:t xml:space="preserve">Santa Cruz de la Sierra, Bolivia | +591 75009349 | +1 914 222 3263 | jimrequena@bolivianotech.com</w:t>
       </w:r>
     </w:p>
     <w:p>
@@ -79,7 +79,7 @@
           <w:sz w:val="21"/>
           <w:szCs w:val="21"/>
         </w:rPr>
-        <w:t xml:space="preserve">Certified Systems Engineer with a Master's degree in Computer Science (Flexible Intelligent Systems) and over 20 years leading the planning, tracking, and control of technology projects for clients across Bolivia, Latin America, and the United States. Has served as Project Manager, Business Analyst, and Scrum-of-Scrums coordinator for organizations including Oktana (Salesforce partner), Digital Harbor, Orbis Compliance, and Huawei Technologies, managing cross-functional teams (development, QA, support, attorneys, and engineers), schedule and risk control, and executive reporting for stakeholders. Complements this background with experience as Business Analyst and Product Owner at Encora, Derco (now Inchcape), and Oktana, and with a recent role as Software Architect and Data Governance Specialist at the Nexus Robotics Group, where he designed serverless architectures and led a data governance maturity assessment. Currently combines project leadership with hands-on technical delivery: founder and technical lead of a portfolio of 8 independent software ventures, building AI agents, n8n automations, and full-stack SaaS applications (Laravel, Angular), and managing product delivery through GitHub Issues and Projects. Holds senior agile certifications (CSPO, CT-SM, ACPC, SMPC) and advanced command of Microsoft Project under PMBOK, Excel, and Power BI. Currently serves as Agile Project Manager on the US-BSW proposal to the U.S. Department of State (in partnership with IAdáptate Bolivia and Platypus LLC, a Carnegie Mellon University spin-off) and teaches Systems Engineering and Artificial Intelligence at the university level.</w:t>
+        <w:t xml:space="preserve">Certified Systems Engineer with a Master's degree in Computer Science (Flexible Intelligent Systems) and over 20 years leading the planning, tracking, and control of technology projects for clients across Bolivia, Latin America, and the United States. Has served as Project Manager, Business Analyst, and Scrum-of-Scrums coordinator for organizations including Oktana (Salesforce partner), Digital Harbor, Orbis Compliance, and Huawei Technologies, managing cross-functional teams (development, QA, support, attorneys, and engineers), schedule and risk control, and executive reporting for stakeholders. Complements this background with experience as Business Analyst and Product Owner at Encora, Derco (now Inchcape), and Oktana, and with a recent role as Software Architect and Data Governance Specialist at InAdvance, where he designed serverless architectures and led a data governance maturity assessment. Currently combines project leadership with hands-on technical delivery: founder and technical lead of a portfolio of 7 independent software ventures, building AI agents, n8n automations, and full-stack SaaS applications (Laravel, Angular), and managing product delivery through GitHub Issues and Projects. Holds senior agile certifications (CSPO, CT-SM, ACPC, SMPC) and advanced command of Microsoft Project under PMBOK, Excel, and Power BI. Currently serves as Agile Project Manager on the US-BSW proposal to the U.S. Department of State (in partnership with IAdáptate Bolivia and Platypus LLC, a Carnegie Mellon University spin-off) and teaches Systems Engineering and Artificial Intelligence at the university level.</w:t>
       </w:r>
     </w:p>
     <w:p>
@@ -163,22 +163,22 @@
           <w:sz w:val="22"/>
           <w:szCs w:val="22"/>
         </w:rPr>
-        <w:t xml:space="preserve"> | Santa Cruz, Bolivia | 2025 – Present</w:t>
-      </w:r>
-    </w:p>
-    <w:p>
-      <w:pPr>
-        <w:spacing w:after="120"/>
-        <w:jc w:val="both"/>
-      </w:pPr>
-      <w:r>
-        <w:rPr>
-          <w:rFonts w:ascii="Calibri" w:cs="Calibri" w:eastAsia="Calibri" w:hAnsi="Calibri"/>
-          <w:color w:val="000000"/>
-          <w:sz w:val="21"/>
-          <w:szCs w:val="21"/>
-        </w:rPr>
-        <w:t xml:space="preserve">Founded and lead technical delivery for a growing portfolio of 8 custom software products, combining hands-on full-stack development, AI agent design, and workflow automation. Manages product backlogs, sprints, and delivery tracking through GitHub Issues and GitHub Projects, and is currently completing specialized training in building a first SaaS application end-to-end with Laravel (backend/API) and Angular (frontend).</w:t>
+        <w:t xml:space="preserve"> | Santa Cruz, Bolivia | 2023 – Present</w:t>
+      </w:r>
+    </w:p>
+    <w:p>
+      <w:pPr>
+        <w:spacing w:after="120"/>
+        <w:jc w:val="both"/>
+      </w:pPr>
+      <w:r>
+        <w:rPr>
+          <w:rFonts w:ascii="Calibri" w:cs="Calibri" w:eastAsia="Calibri" w:hAnsi="Calibri"/>
+          <w:color w:val="000000"/>
+          <w:sz w:val="21"/>
+          <w:szCs w:val="21"/>
+        </w:rPr>
+        <w:t xml:space="preserve">Founded and leads technical delivery for a growing portfolio of 7 custom software products, combining hands-on full-stack development, AI agent design, and workflow automation. Manages backlogs, sprints, and delivery tracking through GitHub Issues and GitHub Projects, and is currently completing specialized training in AI-DLC and in building SaaS applications with Laravel (backend/API) and Angular (frontend).</w:t>
       </w:r>
     </w:p>
     <w:p>
@@ -278,7 +278,7 @@
           <w:sz w:val="21"/>
           <w:szCs w:val="21"/>
         </w:rPr>
-        <w:t xml:space="preserve">URBO (Co-Founder) — Mobile information system providing real-time tracking of public transit bus ("micro") routes for passengers and operators.</w:t>
+        <w:t xml:space="preserve">Personal CRM for Ceviche Sales — Lightweight CRM to manage orders, customers, and delivery logistics for a small food business.</w:t>
       </w:r>
     </w:p>
     <w:p>
@@ -298,7 +298,7 @@
           <w:sz w:val="21"/>
           <w:szCs w:val="21"/>
         </w:rPr>
-        <w:t xml:space="preserve">Personal CRM for Ceviche Sales — Lightweight CRM to manage orders, customers, and delivery logistics for a small food business.</w:t>
+        <w:t xml:space="preserve">Self-Service Kiosks — Unattended retail-kiosk software for general merchandise sales.</w:t>
       </w:r>
     </w:p>
     <w:p>
@@ -318,26 +318,6 @@
           <w:sz w:val="21"/>
           <w:szCs w:val="21"/>
         </w:rPr>
-        <w:t xml:space="preserve">Self-Service Kiosks — Unattended retail-kiosk software for general merchandise sales.</w:t>
-      </w:r>
-    </w:p>
-    <w:p>
-      <w:pPr>
-        <w:pStyle w:val="ListParagraph"/>
-        <w:numPr>
-          <w:ilvl w:val="0"/>
-          <w:numId w:val="2"/>
-        </w:numPr>
-        <w:spacing w:after="60"/>
-        <w:jc w:val="both"/>
-      </w:pPr>
-      <w:r>
-        <w:rPr>
-          <w:rFonts w:ascii="Calibri" w:cs="Calibri" w:eastAsia="Calibri" w:hAnsi="Calibri"/>
-          <w:color w:val="000000"/>
-          <w:sz w:val="21"/>
-          <w:szCs w:val="21"/>
-        </w:rPr>
         <w:t xml:space="preserve">Medical Appointment Booking System — Online scheduling platform for clinic and medical-practice appointments.</w:t>
       </w:r>
     </w:p>
@@ -353,7 +333,7 @@
           <w:sz w:val="21"/>
           <w:szCs w:val="21"/>
         </w:rPr>
-        <w:t xml:space="preserve">Applies AI agents and n8n automations across these ventures to streamline customer communication, scheduling, billing reminders, and operational reporting.</w:t>
+        <w:t xml:space="preserve">Applies AI agents and n8n automations across these ventures to streamline customer communication, scheduling, surveys, payment reminders, collections, and operational reporting.</w:t>
       </w:r>
     </w:p>
     <w:p>
@@ -436,7 +416,7 @@
           <w:sz w:val="22"/>
           <w:szCs w:val="22"/>
         </w:rPr>
-        <w:t xml:space="preserve">Coordinator — Nexus Robotics Group (NexusPatio Tech and Motoclick)</w:t>
+        <w:t xml:space="preserve">Consulting Coordinator — NexusPatio Tech and Motoclick</w:t>
       </w:r>
       <w:r>
         <w:rPr>
@@ -449,22 +429,22 @@
           <w:sz w:val="22"/>
           <w:szCs w:val="22"/>
         </w:rPr>
-        <w:t xml:space="preserve"> | Bolivia / USA | 12/2025 – Present</w:t>
-      </w:r>
-    </w:p>
-    <w:p>
-      <w:pPr>
-        <w:spacing w:after="120"/>
-        <w:jc w:val="both"/>
-      </w:pPr>
-      <w:r>
-        <w:rPr>
-          <w:rFonts w:ascii="Calibri" w:cs="Calibri" w:eastAsia="Calibri" w:hAnsi="Calibri"/>
-          <w:color w:val="000000"/>
-          <w:sz w:val="21"/>
-          <w:szCs w:val="21"/>
-        </w:rPr>
-        <w:t xml:space="preserve">Coordinates technology projects across the Nexus Robotics Group's business units: Patio Service and NexusPatio Tech, its delivery services in Bolivia, and Motoclick, its delivery unit in the United States. Tracks scope, schedule, and progress of projects across the group's different business lines.</w:t>
+        <w:t xml:space="preserve"> | Bolivia / USA | 12/2025 – 08/2026</w:t>
+      </w:r>
+    </w:p>
+    <w:p>
+      <w:pPr>
+        <w:spacing w:after="120"/>
+        <w:jc w:val="both"/>
+      </w:pPr>
+      <w:r>
+        <w:rPr>
+          <w:rFonts w:ascii="Calibri" w:cs="Calibri" w:eastAsia="Calibri" w:hAnsi="Calibri"/>
+          <w:color w:val="000000"/>
+          <w:sz w:val="21"/>
+          <w:szCs w:val="21"/>
+        </w:rPr>
+        <w:t xml:space="preserve">Coordinated technology projects across Patio Service and NexusPatio Tech's business units, its delivery services in Bolivia, and Motoclick, its delivery unit in the United States. Reorganized and tracked scope, schedule, and progress of projects across the group's different business lines.</w:t>
       </w:r>
     </w:p>
     <w:p>
@@ -482,7 +462,7 @@
           <w:sz w:val="22"/>
           <w:szCs w:val="22"/>
         </w:rPr>
-        <w:t xml:space="preserve">Software Architect | Data Governance Specialist — Nexus Robotics Group</w:t>
+        <w:t xml:space="preserve">Software Architect | Data Governance Specialist — InAdvance</w:t>
       </w:r>
       <w:r>
         <w:rPr>
@@ -495,7 +475,7 @@
           <w:sz w:val="22"/>
           <w:szCs w:val="22"/>
         </w:rPr>
-        <w:t xml:space="preserve"> | Santa Cruz, Bolivia | 02/2025 – 12/2025</w:t>
+        <w:t xml:space="preserve"> | 02/2025 – 12/2025</w:t>
       </w:r>
     </w:p>
     <w:p>
@@ -1017,22 +997,22 @@
           <w:sz w:val="21"/>
           <w:szCs w:val="21"/>
         </w:rPr>
-        <w:t xml:space="preserve">Continuous teaching record, concurrently instructing courses in programming, information systems, operating systems, software engineering, business intelligence, and currently artificial intelligence. Integrates AI transparently and pedagogically into the assessed process. Speaker on AI agents at the UPDS AI &amp; Digital Technologies Congress (May 2026).</w:t>
-      </w:r>
-    </w:p>
-    <w:p>
-      <w:pPr>
-        <w:spacing w:after="120"/>
-        <w:jc w:val="both"/>
-      </w:pPr>
-      <w:r>
-        <w:rPr>
-          <w:rFonts w:ascii="Calibri" w:cs="Calibri" w:eastAsia="Calibri" w:hAnsi="Calibri"/>
-          <w:color w:val="000000"/>
-          <w:sz w:val="21"/>
-          <w:szCs w:val="21"/>
-        </w:rPr>
-        <w:t xml:space="preserve">Courses taught: Systems Auditing I, Databases II, Web Design II, Software Engineering I &amp; II, Artificial Intelligence I, Business Intelligence, Programming II, III &amp; IV, Web Programming II, Information Systems I &amp; II, Operating Systems II, Web Technologies II. Current load: Web Technologies II (7th semester), Systems Auditing I (9th semester), Artificial Intelligence I (9th semester).</w:t>
+        <w:t xml:space="preserve">Continuous teaching record, concurrently instructing courses in programming, information systems, operating systems, Software Engineering II, Business Intelligence, and Artificial Intelligence, and currently Software Engineering I. Integrates AI transparently and pedagogically into the assessed process. Speaker on AI agents at the UPDS AI &amp; Digital Technologies Congress (May 2026). Currently participates in developing the Postgraduate Diploma in Artificial Intelligence Applied to Business Environments and is writing an article on GUIDE, a guide to authorship ethics in building evaluation rubrics.</w:t>
+      </w:r>
+    </w:p>
+    <w:p>
+      <w:pPr>
+        <w:spacing w:after="120"/>
+        <w:jc w:val="both"/>
+      </w:pPr>
+      <w:r>
+        <w:rPr>
+          <w:rFonts w:ascii="Calibri" w:cs="Calibri" w:eastAsia="Calibri" w:hAnsi="Calibri"/>
+          <w:color w:val="000000"/>
+          <w:sz w:val="21"/>
+          <w:szCs w:val="21"/>
+        </w:rPr>
+        <w:t xml:space="preserve">Courses taught: Systems Auditing I, Databases II, Web Design II, Software Engineering I &amp; II, Artificial Intelligence I, Business Intelligence, Programming II, III &amp; IV, Web Programming II, Information Systems I &amp; II, Operating Systems II, Web Technologies II. Current load: Software Engineering I, 7:00–10:00 PM (6th semester).</w:t>
       </w:r>
     </w:p>
     <w:p>
@@ -1050,7 +1030,7 @@
           <w:sz w:val="22"/>
           <w:szCs w:val="22"/>
         </w:rPr>
-        <w:t xml:space="preserve">Professor — Databases I &amp; II, Web Programming (Oracle) — UTEPSA</w:t>
+        <w:t xml:space="preserve">Professor — Databases I &amp; II, Web Programming — UTEPSA</w:t>
       </w:r>
       <w:r>
         <w:rPr>
@@ -1078,7 +1058,7 @@
           <w:sz w:val="21"/>
           <w:szCs w:val="21"/>
         </w:rPr>
-        <w:t xml:space="preserve">Taught Databases I and II and Web Programming with jQuery Mobile; facilitated software project workshops.</w:t>
+        <w:t xml:space="preserve">Taught Databases I and II and Web Programming with jQuery Mobile; facilitated Web App project workshops.</w:t>
       </w:r>
     </w:p>
     <w:p>
@@ -1139,7 +1119,7 @@
           <w:sz w:val="21"/>
           <w:szCs w:val="21"/>
         </w:rPr>
-        <w:t xml:space="preserve">Additional teaching: Escuela Naval Militar (ENM) (1996); Teaching Assistant, School of Engineering, Universidad Mayor de San Andrés (UMSA), La Paz (1998); Computer Center Assistant, Universidad Católica Boliviana "San Pablo," La Paz (2001); Oracle Developer Instructor, Instituto Cognos (2008).</w:t>
+        <w:t xml:space="preserve">Additional teaching: Escuela Naval Militar (ENM) (1996); Teaching Assistant, School of Engineering, Universidad Mayor de San Andrés (UMSA), La Paz (1998); Computer Center Assistant, Universidad Católica Boliviana "San Pablo," La Paz (2001); Oracle Instructor at Instituto Cognos (2008) and Programming Instructor at Instituto Domingo Savio.</w:t>
       </w:r>
     </w:p>
     <w:p>
@@ -1176,52 +1156,6 @@
           <w:sz w:val="22"/>
           <w:szCs w:val="22"/>
         </w:rPr>
-        <w:t xml:space="preserve">Full-Stack SaaS Development — Laravel &amp; Angular</w:t>
-      </w:r>
-      <w:r>
-        <w:rPr>
-          <w:rFonts w:ascii="Calibri" w:cs="Calibri" w:eastAsia="Calibri" w:hAnsi="Calibri"/>
-          <w:b/>
-          <w:bCs/>
-          <w:i/>
-          <w:iCs/>
-          <w:color w:val="404040"/>
-          <w:sz w:val="22"/>
-          <w:szCs w:val="22"/>
-        </w:rPr>
-        <w:t xml:space="preserve"> | 2026</w:t>
-      </w:r>
-    </w:p>
-    <w:p>
-      <w:pPr>
-        <w:spacing w:after="120"/>
-        <w:jc w:val="both"/>
-      </w:pPr>
-      <w:r>
-        <w:rPr>
-          <w:rFonts w:ascii="Calibri" w:cs="Calibri" w:eastAsia="Calibri" w:hAnsi="Calibri"/>
-          <w:color w:val="000000"/>
-          <w:sz w:val="21"/>
-          <w:szCs w:val="21"/>
-        </w:rPr>
-        <w:t xml:space="preserve">Hands-on course building a first SaaS application end-to-end: REST API and backend architecture with Laravel, and SPA frontend with Angular.</w:t>
-      </w:r>
-    </w:p>
-    <w:p>
-      <w:pPr>
-        <w:spacing w:after="40" w:before="160"/>
-      </w:pPr>
-      <w:r>
-        <w:rPr>
-          <w:rFonts w:ascii="Calibri" w:cs="Calibri" w:eastAsia="Calibri" w:hAnsi="Calibri"/>
-          <w:b/>
-          <w:bCs/>
-          <w:i w:val="false"/>
-          <w:iCs w:val="false"/>
-          <w:color w:val="000000"/>
-          <w:sz w:val="22"/>
-          <w:szCs w:val="22"/>
-        </w:rPr>
         <w:t xml:space="preserve">M.Sc. in Mathematical Engineering and Computer Science</w:t>
       </w:r>
       <w:r>
@@ -1382,26 +1316,26 @@
           <w:sz w:val="21"/>
           <w:szCs w:val="21"/>
         </w:rPr>
-        <w:t xml:space="preserve">PMBOK, Microsoft Project, Jira, Confluence, GitHub Issues &amp; Projects, Scrum/Kanban/SAFe, risk and schedule management.</w:t>
-      </w:r>
-    </w:p>
-    <w:p>
-      <w:pPr>
-        <w:spacing w:after="120"/>
-        <w:jc w:val="both"/>
-      </w:pPr>
-      <w:r>
-        <w:rPr>
-          <w:rFonts w:ascii="Calibri" w:cs="Calibri" w:eastAsia="Calibri" w:hAnsi="Calibri"/>
-          <w:b/>
-          <w:bCs/>
-          <w:i w:val="false"/>
-          <w:iCs w:val="false"/>
-          <w:color w:val="000000"/>
-          <w:sz w:val="21"/>
-          <w:szCs w:val="21"/>
-        </w:rPr>
-        <w:t xml:space="preserve">Software Development: </w:t>
+        <w:t xml:space="preserve">PMBOK, project management with Claude AI, GitHub Issues, Microsoft Project, Azure DevOps, Jira, Confluence, ClickUp, Assembla, Scrum/Kanban/SAFe, risk and schedule management.</w:t>
+      </w:r>
+    </w:p>
+    <w:p>
+      <w:pPr>
+        <w:spacing w:after="120"/>
+        <w:jc w:val="both"/>
+      </w:pPr>
+      <w:r>
+        <w:rPr>
+          <w:rFonts w:ascii="Calibri" w:cs="Calibri" w:eastAsia="Calibri" w:hAnsi="Calibri"/>
+          <w:b/>
+          <w:bCs/>
+          <w:i w:val="false"/>
+          <w:iCs w:val="false"/>
+          <w:color w:val="000000"/>
+          <w:sz w:val="21"/>
+          <w:szCs w:val="21"/>
+        </w:rPr>
+        <w:t xml:space="preserve">Software Development &amp; Customization: </w:t>
       </w:r>
       <w:r>
         <w:rPr>
@@ -1414,7 +1348,7 @@
           <w:sz w:val="21"/>
           <w:szCs w:val="21"/>
         </w:rPr>
-        <w:t xml:space="preserve">Laravel, Angular, PHP, JavaScript/TypeScript, Node.js, REST APIs.</w:t>
+        <w:t xml:space="preserve">JavaScript/TypeScript, Node.js, Nest.js, React.js, Laravel, Angular, PHP, microservices, WebSockets, and REST APIs; plus Salesforce (Service/Marketing Cloud), Figma, UML, and advanced Excel.</w:t>
       </w:r>
     </w:p>
     <w:p>
@@ -1446,7 +1380,7 @@
           <w:sz w:val="21"/>
           <w:szCs w:val="21"/>
         </w:rPr>
-        <w:t xml:space="preserve">AI Agents (design &amp; orchestration), n8n workflow automation, Google Dialogflow, LLM-integrated applications.</w:t>
+        <w:t xml:space="preserve">AI Agents (design &amp; orchestration), n8n workflow automation, Google Dialogflow API, and various application/LLM integrations and migrations.</w:t>
       </w:r>
     </w:p>
     <w:p>
@@ -1479,38 +1413,6 @@
           <w:szCs w:val="21"/>
         </w:rPr>
         <w:t xml:space="preserve">SQL Server, PL/SQL, Oracle, Data Mart/Data Warehouse, Power BI, Tableau, SSRS/SSAS/SSIS, Azure Data Lake with PySpark.</w:t>
-      </w:r>
-    </w:p>
-    <w:p>
-      <w:pPr>
-        <w:spacing w:after="120"/>
-        <w:jc w:val="both"/>
-      </w:pPr>
-      <w:r>
-        <w:rPr>
-          <w:rFonts w:ascii="Calibri" w:cs="Calibri" w:eastAsia="Calibri" w:hAnsi="Calibri"/>
-          <w:b/>
-          <w:bCs/>
-          <w:i w:val="false"/>
-          <w:iCs w:val="false"/>
-          <w:color w:val="000000"/>
-          <w:sz w:val="21"/>
-          <w:szCs w:val="21"/>
-        </w:rPr>
-        <w:t xml:space="preserve">Other: </w:t>
-      </w:r>
-      <w:r>
-        <w:rPr>
-          <w:rFonts w:ascii="Calibri" w:cs="Calibri" w:eastAsia="Calibri" w:hAnsi="Calibri"/>
-          <w:b w:val="false"/>
-          <w:bCs w:val="false"/>
-          <w:i w:val="false"/>
-          <w:iCs w:val="false"/>
-          <w:color w:val="000000"/>
-          <w:sz w:val="21"/>
-          <w:szCs w:val="21"/>
-        </w:rPr>
-        <w:t xml:space="preserve">Salesforce (Service/Marketing Cloud), Figma, UML, advanced Excel.</w:t>
       </w:r>
     </w:p>
     <w:p>

</xml_diff>